<commit_message>
Demo upgrades: hallucination X-ray, false-fact test, live agent trace, landscape map
- Hallucination X-ray: click any answer sentence to see the passages it was
  checked against, the verdict and the drafts the agent rewrote
- "Plant a false fact" demo mode (off in production) to show the checker
  catching a changed number, a reversed relation or an invented detail
- Live agent trace: stages and tool calls shown while the answer is written,
  stored with the answer afterwards
- Patent landscape map: EPO results clustered (k-means) and placed with
  t-SNE/PCA, with the user's invention and library documents marked
- Verifier: numbers must match with their units; the LLM second opinion can
  no longer approve a sentence whose numbers are missing from its sources
- Faster, fuller answers: model warm-up at startup, full Wikipedia sections,
  patent abstracts searched for in-scope questions, answers polled while running
- Tests, observations, viva answers and report Appendix A updated
</commit_message>
<xml_diff>
--- a/docs/report/Project_Report.docx
+++ b/docs/report/Project_Report.docx
@@ -15206,6 +15206,27 @@
         <w:rPr>
           <w:b/>
         </w:rPr>
+        <w:t>Number rule (11 October).</w:t>
+      </w:r>
+      <w:r>
+        <w:t xml:space="preserve"> The checker test of Appendix A.2 exposed two ways a changed number passed: the rescue matched "below 120 degrees" because the passage contained "coolant pump 120" (a reference numeral), and the second-opinion LLM confirmed the same sentence while quoting "40 °C" in its reason. Numbers must now match together with their unit, labels such as "S1" or "claim 7" are not treated as quantities, and the LLM cannot confirm a statement whose numbers are not in its passages. Re-measured on the same split (</w:t>
+      </w:r>
+      <w:r>
+        <w:rPr>
+          <w:rFonts w:ascii="Consolas" w:hAnsi="Consolas"/>
+          <w:sz w:val="19"/>
+        </w:rPr>
+        <w:t>exp_i_verifier_choice/20261011-062122</w:t>
+      </w:r>
+      <w:r>
+        <w:t>): strict is unchanged; balanced has 8/137 false alarms instead of 7 (the extra one cites "interior region 104", a numeral its passage does not contain) and still catches 5/9 (development 5/69 and 1/3; test 2/68 and 4/6).</w:t>
+      </w:r>
+    </w:p>
+    <w:p>
+      <w:r>
+        <w:rPr>
+          <w:b/>
+        </w:rPr>
         <w:t>How far to trust these numbers.</w:t>
       </w:r>
       <w:r>
@@ -16483,6 +16504,119 @@
       </w:r>
       <w:r>
         <w:t>, 2015, pp. 632–642.</w:t>
+      </w:r>
+    </w:p>
+    <w:p>
+      <w:r>
+        <w:t xml:space="preserve">[25] L. van der Maaten and G. Hinton, "Visualizing Data using t-SNE," </w:t>
+      </w:r>
+      <w:r>
+        <w:rPr>
+          <w:i/>
+        </w:rPr>
+        <w:t>Journal of Machine Learning Research</w:t>
+      </w:r>
+      <w:r>
+        <w:t>, vol. 9, no. 86, pp. 2579–2605, 2008.</w:t>
+      </w:r>
+    </w:p>
+    <w:p>
+      <w:r>
+        <w:t xml:space="preserve">[26] D. Arthur and S. Vassilvitskii, "k-means++: The Advantages of Careful Seeding," in </w:t>
+      </w:r>
+      <w:r>
+        <w:rPr>
+          <w:i/>
+        </w:rPr>
+        <w:t>Proc. 18th Annual ACM-SIAM Symposium on Discrete Algorithms (SODA)</w:t>
+      </w:r>
+      <w:r>
+        <w:t>, 2007, pp. 1027–1035.</w:t>
+      </w:r>
+    </w:p>
+    <w:p>
+      <w:r>
+        <w:br w:type="page"/>
+      </w:r>
+    </w:p>
+    <w:p>
+      <w:pPr>
+        <w:pStyle w:val="Heading1"/>
+      </w:pPr>
+      <w:r>
+        <w:t>Appendix A. Extensions After the Evaluation</w:t>
+      </w:r>
+    </w:p>
+    <w:p>
+      <w:r>
+        <w:t>The features in this appendix were added after the experiments in Chapters 5 and 6. They change what the user sees, not how answers are retrieved, generated or checked, so the reported results still describe the system.</w:t>
+      </w:r>
+    </w:p>
+    <w:p>
+      <w:pPr>
+        <w:pStyle w:val="Heading2"/>
+      </w:pPr>
+      <w:r>
+        <w:t>A.1 Hallucination X-ray</w:t>
+      </w:r>
+    </w:p>
+    <w:p>
+      <w:r>
+        <w:t>The verifier (Section 3.5) produces a verdict for every sentence of an answer, but a single "9 of 10 statements verified" line hides that work. The X-ray view exposes it. Each checked sentence is coloured: green when its cited passage supports it, amber when it is only partly supported or a passage it did not cite supports it, and red when no passage supports it. Selecting a sentence opens an inspector with the passage it was judged against, the checker's reason and score, and the words the passage shares with the sentence. The shared words are a reading aid only; the verdict comes from the entailment model and, for flagged sentences, the LLM second opinion.</w:t>
+      </w:r>
+    </w:p>
+    <w:p>
+      <w:r>
+        <w:t>When the first answer fails the check and is regenerated with feedback (Section 3.5), the X-ray shows the rejected draft beside the final answer, with the dropped sentences struck through and the grounding of both. To support this, each attempt now stores its sentence-level verdicts alongside its counts.</w:t>
+      </w:r>
+    </w:p>
+    <w:p>
+      <w:r>
+        <w:t>While testing the view, a layout defect was found: in conversations taller than the screen, the top of the thread could not be scrolled into view. It was caused by a decorative background layer that the flex layout shrank while keeping its negative margin, and is fixed.</w:t>
+      </w:r>
+    </w:p>
+    <w:p>
+      <w:pPr>
+        <w:pStyle w:val="Heading2"/>
+      </w:pPr>
+      <w:r>
+        <w:t>A.2 Checker test: planting a false sentence</w:t>
+      </w:r>
+    </w:p>
+    <w:p>
+      <w:r>
+        <w:t>A verifier is easiest to trust when it can be watched catching a mistake. The chat's X-ray therefore offers "Plant a false fact": the same question is answered again, and before verification one sentence of the first draft is made false in a way typical of hallucinations, keeping its citation so it still looks sourced. A number is changed (e.g. "10 Hz" to "30 Hz"); if the draft has none, a direction word is reversed ("increases" to "decreases"); otherwise a plausible invented detail is added. The verifier is not told which sentence was changed. If it flags the sentence, the answer is regenerated with that feedback even when the overall grounding is above the regeneration threshold, and the X-ray shows the rejected draft with the planted sentence marked. The outcome is reported as it happened, including a miss. The mode is off in production and never used by the experiments.</w:t>
+      </w:r>
+    </w:p>
+    <w:p>
+      <w:r>
+        <w:t>The first live test found a real weakness. The planted "below 120 degrees Celsius" (the patent says 40 °C) passed as supported: the lexical rescue found "120" in the passage as the reference numeral of the cooling channels, and the second-opinion LLM confirmed the sentence while quoting 40 °C in its own reason. After the number rule described in Section 6.6, five checker tests on the battery patent (four changed numbers, one invented detail) were all caught and removed by regeneration, against three of five before. Five tests are an illustration, not a measurement; the cost of the rule on the labelled statements is one additional false alarm in 137 (Section 6.6).</w:t>
+      </w:r>
+    </w:p>
+    <w:p>
+      <w:pPr>
+        <w:pStyle w:val="Heading2"/>
+      </w:pPr>
+      <w:r>
+        <w:t>A.3 Live agent trace</w:t>
+      </w:r>
+    </w:p>
+    <w:p>
+      <w:r>
+        <w:t>The agent's decisions were visible only after the fact, as a list of tool calls. The chat now shows them while they happen: every graph node (the question-answering flow of Figure 3.3) and every tool call becomes a row with its status, a one-line result, its duration and, for tools, the reason the planner chose it. The reasons are generated from the planner's decision rather than asked of the language model, so they cannot disagree with what the agent did. The page polls the rows once a second; the finished trace is stored with the answer and can be reopened. In a browser check with the local models, a 50-second answer showed its first row after 8 seconds and the three chosen tools (library, web, patent abstracts) by 22 seconds. The agent's behaviour is unchanged.</w:t>
+      </w:r>
+    </w:p>
+    <w:p>
+      <w:pPr>
+        <w:pStyle w:val="Heading2"/>
+      </w:pPr>
+      <w:r>
+        <w:t>A.4 Patent landscape map</w:t>
+      </w:r>
+    </w:p>
+    <w:p>
+      <w:r>
+        <w:t>To see a technology area at a glance, the patents returned for a topic are placed on a map. Each title and abstract is embedded with BGE-M3 (the retrieval model, Section 3.3), k-means with k-means++ starts [26] groups the vectors (k grows with the number of patents, up to six) and t-SNE [25] projects them to two dimensions (PCA when scikit-learn is not installed). Patents and documents in the user's library appear as squares, using the mean vector of their passages; an invention, described or chosen from the library, appears as a star joined to its five most similar patents. Each cluster is named by the two words or phrases most typical of it; patent boilerplate ("the utility model discloses") had to be excluded for the names to be meaningful. Nothing is imported. The page states that 2D distances are approximate and that the similarity is technical, not legal.</w:t>
       </w:r>
     </w:p>
     <w:sectPr>

</xml_diff>

<commit_message>
Live chat, redesign, everyday answers and the Fact Checker
- Live chat: answers stream in with sources as they are found and live checker
  verdicts; Stop, copy, try again, edit and follow-up questions; parallel searches;
  an optional cloud model per user
- Everyday answers: date and time, exact arithmetic, and labelled general-knowledge
  answers when no source has one
- Redesign after the reference site: dark default, floating pill navigation, glass
  cards, landing page; collapsible chat sidebar (Ctrl/Cmd+B); UI fixes at every width
- Checker: the wrong words underlined, "contradicts its source" vs "not found",
  false-premise note, fix a sentence (remove, rewrite from the source, restore),
  and a Fact Checker page with the checker's record
- make share uploads only the website to Vercel (.vercelignore)
- Docs: observations, viva Q&A 71-86, report appendix A.5-A.7
</commit_message>
<xml_diff>
--- a/docs/report/Project_Report.docx
+++ b/docs/report/Project_Report.docx
@@ -15227,6 +15227,27 @@
         <w:rPr>
           <w:b/>
         </w:rPr>
+        <w:t>Direction rule (22 October).</w:t>
+      </w:r>
+      <w:r>
+        <w:t xml:space="preserve"> Checker tests in the live chat (Appendix A.5) that reversed a direction word passed three different stages. "Increase the contact" changed to "decrease the contact" was flagged by NLI but confirmed by the second-opinion LLM, whose reason quoted "increase". "Immersion cooling systems" changed to "immersion heating systems" was passed by the key-word rescue, because "heat" occurs elsewhere in the passage ("heat dissipation"). And the NLI model itself entailed "the resistance of the coil decreases" from "the resistance of the coil increases" (p = 0.79). A statement is now unsupported, whichever stage judged it, when a direction word from the rescue's list (increase, higher, above, before, open, heat, …) stands next to a word that, in the supporting passage, stands next to the opposite and never next to the word itself, in either order ("heating liquid" against "liquid cooling"). The rescue keeps its looser whole-text test as well. A first version used that whole-text test for all stages and added one false alarm (9/137: "one or more coils" against "less than the threshold"); the phrase test flags none of the 150 labelled statements. Re-measured on the same split (</w:t>
+      </w:r>
+      <w:r>
+        <w:rPr>
+          <w:rFonts w:ascii="Consolas" w:hAnsi="Consolas"/>
+          <w:sz w:val="19"/>
+        </w:rPr>
+        <w:t>exp_i_verifier_choice/20261022-171312</w:t>
+      </w:r>
+      <w:r>
+        <w:t>): every result is identical to the run above, so the rule's value rests on the checker tests rather than on these labels. Because the checker test's planter reverses words from an overlapping list, reversed-relation tests now mainly exercise this rule.</w:t>
+      </w:r>
+    </w:p>
+    <w:p>
+      <w:r>
+        <w:rPr>
+          <w:b/>
+        </w:rPr>
         <w:t>How far to trust these numbers.</w:t>
       </w:r>
       <w:r>
@@ -15992,7 +16013,7 @@
         <w:t>False premises.</w:t>
       </w:r>
       <w:r>
-        <w:t xml:space="preserve"> A question that presupposes something absent from the patent ("which neural network does the Kalman-filter patent train?") was answered about what the patent does contain instead of rejecting the premise; verification flagged most of that answer.</w:t>
+        <w:t xml:space="preserve"> A question that presupposes something absent from the patent ("which neural network does the Kalman-filter patent train?") was answered about what the patent does contain instead of rejecting the premise; verification flagged most of that answer. A word-based premise check was added to the application afterwards (Appendix A.7); it is not part of the evaluated system.</w:t>
       </w:r>
     </w:p>
     <w:p>
@@ -16199,7 +16220,7 @@
         <w:pStyle w:val="ListBullet"/>
       </w:pPr>
       <w:r>
-        <w:t>A premise check before answering: detect when a question presupposes something the evidence does not mention, and say so.</w:t>
+        <w:t>A premise check before answering: detect when a question presupposes something the evidence does not mention, and say so. A word-based version is in the application (Appendix A.7); a meaning-based check, and measuring it, remain future work.</w:t>
       </w:r>
     </w:p>
     <w:p>
@@ -16617,6 +16638,70 @@
     <w:p>
       <w:r>
         <w:t>To see a technology area at a glance, the patents returned for a topic are placed on a map. Each title and abstract is embedded with BGE-M3 (the retrieval model, Section 3.3), k-means with k-means++ starts [26] groups the vectors (k grows with the number of patents, up to six) and t-SNE [25] projects them to two dimensions (PCA when scikit-learn is not installed). Patents and documents in the user's library appear as squares, using the mean vector of their passages; an invention, described or chosen from the library, appears as a star joined to its five most similar patents. Each cluster is named by the two words or phrases most typical of it; patent boilerplate ("the utility model discloses") had to be excluded for the names to be meaningful. Nothing is imported. The page states that 2D distances are approximate and that the similarity is technical, not legal.</w:t>
+      </w:r>
+    </w:p>
+    <w:p>
+      <w:pPr>
+        <w:pStyle w:val="Heading2"/>
+      </w:pPr>
+      <w:r>
+        <w:t>A.5 Live chat</w:t>
+      </w:r>
+    </w:p>
+    <w:p>
+      <w:r>
+        <w:t>Users found the chat slow: a typical answer took 47–60 seconds and nothing appeared until all of it was ready. The chat now shows the answer as it happens. Above the answer, the stage (understand, search, write, check) and the sources appear as the tools find them. The draft is shown word by word while the model writes it; the reply is streamed, and with the same settings it is the same text as an ordinary request. While the draft is checked, a scan passes over it, and each sentence then takes its verdict colour. If sentences fail, they are shown struck through and the rewritten draft is typed out. The view is fed by the same twice-a-second poll as the agent trace (A.3); the agent's behaviour does not depend on it, and experiments do not use it.</w:t>
+      </w:r>
+    </w:p>
+    <w:p>
+      <w:r>
+        <w:t>Three changes make answers faster without changing them, the first only slightly. The library, web and patent-abstract searches that the planner selects together run concurrently, each with its own database connection, and their results are used in plan order; because they share the embedding model, which runs one job at a time, an A/B test on three questions saved 0–2.5 seconds of the search stage. Questions about the assistant itself ("Can I talk anything?") are answered immediately with its capabilities and example questions; the pattern matches none of the 157 experiment questions. A web source that does not accept a connection within five seconds is abandoned. In a browser test with the local model, a new question showed its first words after 5.7 seconds and was complete and checked after 27.8. After each answer, the model suggests three follow-up questions, written once the answer is shown so that they do not delay it.</w:t>
+      </w:r>
+    </w:p>
+    <w:p>
+      <w:r>
+        <w:t>The tests also found two accuracy problems. The planner judged "How do solid-state batteries work?" out of scope, so only the web was searched, and the passages found were about solid-state drives. When the planner says out of scope and a live search is planned, a one-word technology check now decides whether patent filings are searched, and Wikipedia is searched with the planner's key words rather than the question. Checker tests that reversed a direction ("increase" to "decrease", "immersion cooling" to "immersion heating") were passed by the LLM second opinion, by the key-word rescue and once by the NLI model itself. No stage may now accept a statement whose direction word is reversed within its phrase relative to its supporting passage; the labelled results are unchanged (Section 6.6), and because the test's planter uses an overlapping word list, such tests now mainly exercise this rule.</w:t>
+      </w:r>
+    </w:p>
+    <w:p>
+      <w:pPr>
+        <w:pStyle w:val="Heading2"/>
+      </w:pPr>
+      <w:r>
+        <w:t>A.6 Everyday questions and a chat-assistant feel</w:t>
+      </w:r>
+    </w:p>
+    <w:p>
+      <w:r>
+        <w:t>Further user feedback asked for the chat to behave more like a general chat assistant. Questions that need no source are now answered exactly: the date and time from the clock, in the user's time zone, and arithmetic from a calculator that accepts only numbers and arithmetic operators. Both are recognised by rules and take under a second. When a general question finds nothing in the library, the patent offices or the web, or for a writing task such as a poem, the model answers from its general knowledge. Such answers carry the label "General knowledge · not from sources, not checked", because the checker has no passages to check them against; in a test one of them contained a false statement, which is the reason for the label. They appear only in the chat, never in the /ask API or the experiments.</w:t>
+      </w:r>
+    </w:p>
+    <w:p>
+      <w:r>
+        <w:t>Chat answers are written in a chat style (a direct answer first, then short paragraphs and lists) at a length the user chooses, and are rendered with lists, numbered steps and line breaks. As in common chat assistants, an answer can be stopped (what was written is kept, marked as not checked), copied with its sources, asked again, or edited and resent, and its sources appear as numbered chips. The local model is kept loaded between questions, and a faster hosted model can be chosen per user; it is off by default, and the profile page states that questions and passages are then sent to the provider.</w:t>
+      </w:r>
+    </w:p>
+    <w:p>
+      <w:pPr>
+        <w:pStyle w:val="Heading2"/>
+      </w:pPr>
+      <w:r>
+        <w:t>A.7 A more informative checker and a Fact Checker page</w:t>
+      </w:r>
+    </w:p>
+    <w:p>
+      <w:r>
+        <w:t>The X-ray now says what is wrong in a flagged sentence, not only that it is flagged. After the verdict, the sentence is compared with the passage it was checked against, and the words at fault are underlined: a number the passage does not have (with the number it does have), a direction reversed within its phrase, an added negation, or words the passage never uses. Unsupported sentences are split into two colours: "contradicts its source", when the passage gives a different number with the same unit or the opposite direction, and "not found in the sources" otherwise. These explanations are computed by rules after the verdict and never change it, so the verdicts and grounding scores reported in Chapter 6 are unaffected.</w:t>
+      </w:r>
+    </w:p>
+    <w:p>
+      <w:r>
+        <w:t>A question can presuppose something no source says (Section 7.3). Before the answer is written, the question's terms that no retrieved passage uses are found and the writer is asked to say plainly when the question assumes them. With the battery document as the only source, questions about a neural network or LiDAR sensors were answered "The sources do not mention ..." followed by cited facts, and three ordinary questions raised no such note. The detection is word-based, so a synonym can trigger it; the note is therefore shown only when the answer itself states the absence. It is switched off in experiment reruns.</w:t>
+      </w:r>
+    </w:p>
+    <w:p>
+      <w:r>
+        <w:t>A flagged sentence can be removed, or rewritten from its source: the model rewrites only that sentence from the passage and the checker checks it again, refusing the rewrite if the sources do not back it. The original answer and its verdicts are kept and can be restored. A new Fact Checker page applies the same checking to any pasted text, for example an answer from another AI assistant: each sentence is matched to its closest passages in the user's documents and patents with the same hybrid retrieval and checked by the same verifier. It also lists what the checker found in the user's earlier answers.</w:t>
       </w:r>
     </w:p>
     <w:sectPr>

</xml_diff>